<commit_message>
Add held-out budget evaluation, reliability analysis, and progress report 5
</commit_message>
<xml_diff>
--- a/docs/Progress_Reports/Progress_Report_2.docx
+++ b/docs/Progress_Reports/Progress_Report_2.docx
@@ -139,6 +139,7 @@
         <w:pStyle w:val="Heading1"/>
       </w:pPr>
       <w:r>
+        <w:lastRenderedPageBreak/>
         <w:t>Step 2 Split the data into development and test sets</w:t>
       </w:r>
     </w:p>
@@ -154,10 +155,10 @@
     </w:p>
     <w:tbl>
       <w:tblPr>
-        <w:tblW w:type="auto" w:w="0"/>
+        <w:tblW w:w="0" w:type="auto"/>
         <w:jc w:val="center"/>
         <w:tblLayout w:type="fixed"/>
-        <w:tblLook w:firstColumn="1" w:firstRow="1" w:lastColumn="0" w:lastRow="0" w:noHBand="0" w:noVBand="1" w:val="04A0"/>
+        <w:tblLook w:val="04A0" w:firstRow="1" w:lastRow="0" w:firstColumn="1" w:lastColumn="0" w:noHBand="0" w:noVBand="1"/>
       </w:tblPr>
       <w:tblGrid>
         <w:gridCol w:w="2232"/>
@@ -170,29 +171,29 @@
         <w:trPr>
           <w:cantSplit/>
           <w:tblHeader/>
+          <w:jc w:val="center"/>
         </w:trPr>
         <w:tc>
           <w:tcPr>
-            <w:tcW w:type="dxa" w:w="2232"/>
-            <w:vAlign w:val="center"/>
+            <w:tcW w:w="2232" w:type="dxa"/>
+            <w:tcBorders>
+              <w:top w:val="single" w:sz="4" w:space="0" w:color="D9D9D9"/>
+              <w:left w:val="single" w:sz="4" w:space="0" w:color="D9D9D9"/>
+              <w:bottom w:val="single" w:sz="4" w:space="0" w:color="D9D9D9"/>
+              <w:right w:val="single" w:sz="4" w:space="0" w:color="D9D9D9"/>
+            </w:tcBorders>
+            <w:shd w:val="clear" w:color="auto" w:fill="E7EEF4"/>
             <w:tcMar>
               <w:top w:w="90" w:type="dxa"/>
               <w:left w:w="90" w:type="dxa"/>
               <w:bottom w:w="90" w:type="dxa"/>
               <w:right w:w="90" w:type="dxa"/>
             </w:tcMar>
-            <w:tcBorders>
-              <w:top w:val="single" w:sz="4" w:color="D9D9D9"/>
-              <w:left w:val="single" w:sz="4" w:color="D9D9D9"/>
-              <w:bottom w:val="single" w:sz="4" w:color="D9D9D9"/>
-              <w:right w:val="single" w:sz="4" w:color="D9D9D9"/>
-            </w:tcBorders>
-            <w:shd w:fill="E7EEF4"/>
+            <w:vAlign w:val="center"/>
           </w:tcPr>
           <w:p>
             <w:pPr>
               <w:spacing w:after="0" w:line="240" w:lineRule="auto"/>
-              <w:jc w:val="left"/>
             </w:pPr>
             <w:r>
               <w:rPr>
@@ -205,21 +206,21 @@
         </w:tc>
         <w:tc>
           <w:tcPr>
-            <w:tcW w:type="dxa" w:w="1786"/>
-            <w:vAlign w:val="center"/>
+            <w:tcW w:w="1786" w:type="dxa"/>
+            <w:tcBorders>
+              <w:top w:val="single" w:sz="4" w:space="0" w:color="D9D9D9"/>
+              <w:left w:val="single" w:sz="4" w:space="0" w:color="D9D9D9"/>
+              <w:bottom w:val="single" w:sz="4" w:space="0" w:color="D9D9D9"/>
+              <w:right w:val="single" w:sz="4" w:space="0" w:color="D9D9D9"/>
+            </w:tcBorders>
+            <w:shd w:val="clear" w:color="auto" w:fill="E7EEF4"/>
             <w:tcMar>
               <w:top w:w="90" w:type="dxa"/>
               <w:left w:w="90" w:type="dxa"/>
               <w:bottom w:w="90" w:type="dxa"/>
               <w:right w:w="90" w:type="dxa"/>
             </w:tcMar>
-            <w:tcBorders>
-              <w:top w:val="single" w:sz="4" w:color="D9D9D9"/>
-              <w:left w:val="single" w:sz="4" w:color="D9D9D9"/>
-              <w:bottom w:val="single" w:sz="4" w:color="D9D9D9"/>
-              <w:right w:val="single" w:sz="4" w:color="D9D9D9"/>
-            </w:tcBorders>
-            <w:shd w:fill="E7EEF4"/>
+            <w:vAlign w:val="center"/>
           </w:tcPr>
           <w:p>
             <w:pPr>
@@ -232,6 +233,12 @@
                 <w:sz w:val="20"/>
               </w:rPr>
               <w:t>Development</w:t>
+            </w:r>
+            <w:r>
+              <w:rPr>
+                <w:b/>
+                <w:sz w:val="20"/>
+              </w:rPr>
               <w:br/>
               <w:t>customers</w:t>
             </w:r>
@@ -239,21 +246,21 @@
         </w:tc>
         <w:tc>
           <w:tcPr>
-            <w:tcW w:type="dxa" w:w="1786"/>
-            <w:vAlign w:val="center"/>
+            <w:tcW w:w="1786" w:type="dxa"/>
+            <w:tcBorders>
+              <w:top w:val="single" w:sz="4" w:space="0" w:color="D9D9D9"/>
+              <w:left w:val="single" w:sz="4" w:space="0" w:color="D9D9D9"/>
+              <w:bottom w:val="single" w:sz="4" w:space="0" w:color="D9D9D9"/>
+              <w:right w:val="single" w:sz="4" w:space="0" w:color="D9D9D9"/>
+            </w:tcBorders>
+            <w:shd w:val="clear" w:color="auto" w:fill="E7EEF4"/>
             <w:tcMar>
               <w:top w:w="90" w:type="dxa"/>
               <w:left w:w="90" w:type="dxa"/>
               <w:bottom w:w="90" w:type="dxa"/>
               <w:right w:w="90" w:type="dxa"/>
             </w:tcMar>
-            <w:tcBorders>
-              <w:top w:val="single" w:sz="4" w:color="D9D9D9"/>
-              <w:left w:val="single" w:sz="4" w:color="D9D9D9"/>
-              <w:bottom w:val="single" w:sz="4" w:color="D9D9D9"/>
-              <w:right w:val="single" w:sz="4" w:color="D9D9D9"/>
-            </w:tcBorders>
-            <w:shd w:fill="E7EEF4"/>
+            <w:vAlign w:val="center"/>
           </w:tcPr>
           <w:p>
             <w:pPr>
@@ -266,6 +273,12 @@
                 <w:sz w:val="20"/>
               </w:rPr>
               <w:t>Development</w:t>
+            </w:r>
+            <w:r>
+              <w:rPr>
+                <w:b/>
+                <w:sz w:val="20"/>
+              </w:rPr>
               <w:br/>
               <w:t>purchases</w:t>
             </w:r>
@@ -273,21 +286,21 @@
         </w:tc>
         <w:tc>
           <w:tcPr>
-            <w:tcW w:type="dxa" w:w="1786"/>
-            <w:vAlign w:val="center"/>
+            <w:tcW w:w="1786" w:type="dxa"/>
+            <w:tcBorders>
+              <w:top w:val="single" w:sz="4" w:space="0" w:color="D9D9D9"/>
+              <w:left w:val="single" w:sz="4" w:space="0" w:color="D9D9D9"/>
+              <w:bottom w:val="single" w:sz="4" w:space="0" w:color="D9D9D9"/>
+              <w:right w:val="single" w:sz="4" w:space="0" w:color="D9D9D9"/>
+            </w:tcBorders>
+            <w:shd w:val="clear" w:color="auto" w:fill="E7EEF4"/>
             <w:tcMar>
               <w:top w:w="90" w:type="dxa"/>
               <w:left w:w="90" w:type="dxa"/>
               <w:bottom w:w="90" w:type="dxa"/>
               <w:right w:w="90" w:type="dxa"/>
             </w:tcMar>
-            <w:tcBorders>
-              <w:top w:val="single" w:sz="4" w:color="D9D9D9"/>
-              <w:left w:val="single" w:sz="4" w:color="D9D9D9"/>
-              <w:bottom w:val="single" w:sz="4" w:color="D9D9D9"/>
-              <w:right w:val="single" w:sz="4" w:color="D9D9D9"/>
-            </w:tcBorders>
-            <w:shd w:fill="E7EEF4"/>
+            <w:vAlign w:val="center"/>
           </w:tcPr>
           <w:p>
             <w:pPr>
@@ -300,6 +313,12 @@
                 <w:sz w:val="20"/>
               </w:rPr>
               <w:t>Test</w:t>
+            </w:r>
+            <w:r>
+              <w:rPr>
+                <w:b/>
+                <w:sz w:val="20"/>
+              </w:rPr>
               <w:br/>
               <w:t>customers</w:t>
             </w:r>
@@ -307,21 +326,21 @@
         </w:tc>
         <w:tc>
           <w:tcPr>
-            <w:tcW w:type="dxa" w:w="1771"/>
-            <w:vAlign w:val="center"/>
+            <w:tcW w:w="1771" w:type="dxa"/>
+            <w:tcBorders>
+              <w:top w:val="single" w:sz="4" w:space="0" w:color="D9D9D9"/>
+              <w:left w:val="single" w:sz="4" w:space="0" w:color="D9D9D9"/>
+              <w:bottom w:val="single" w:sz="4" w:space="0" w:color="D9D9D9"/>
+              <w:right w:val="single" w:sz="4" w:space="0" w:color="D9D9D9"/>
+            </w:tcBorders>
+            <w:shd w:val="clear" w:color="auto" w:fill="E7EEF4"/>
             <w:tcMar>
               <w:top w:w="90" w:type="dxa"/>
               <w:left w:w="90" w:type="dxa"/>
               <w:bottom w:w="90" w:type="dxa"/>
               <w:right w:w="90" w:type="dxa"/>
             </w:tcMar>
-            <w:tcBorders>
-              <w:top w:val="single" w:sz="4" w:color="D9D9D9"/>
-              <w:left w:val="single" w:sz="4" w:color="D9D9D9"/>
-              <w:bottom w:val="single" w:sz="4" w:color="D9D9D9"/>
-              <w:right w:val="single" w:sz="4" w:color="D9D9D9"/>
-            </w:tcBorders>
-            <w:shd w:fill="E7EEF4"/>
+            <w:vAlign w:val="center"/>
           </w:tcPr>
           <w:p>
             <w:pPr>
@@ -334,6 +353,12 @@
                 <w:sz w:val="20"/>
               </w:rPr>
               <w:t>Test</w:t>
+            </w:r>
+            <w:r>
+              <w:rPr>
+                <w:b/>
+                <w:sz w:val="20"/>
+              </w:rPr>
               <w:br/>
               <w:t>purchases</w:t>
             </w:r>
@@ -343,32 +368,31 @@
       <w:tr>
         <w:trPr>
           <w:cantSplit/>
+          <w:jc w:val="center"/>
         </w:trPr>
         <w:tc>
           <w:tcPr>
-            <w:tcW w:type="dxa" w:w="2232"/>
-            <w:vAlign w:val="center"/>
+            <w:tcW w:w="2232" w:type="dxa"/>
+            <w:tcBorders>
+              <w:top w:val="single" w:sz="4" w:space="0" w:color="D9D9D9"/>
+              <w:left w:val="single" w:sz="4" w:space="0" w:color="D9D9D9"/>
+              <w:bottom w:val="single" w:sz="4" w:space="0" w:color="D9D9D9"/>
+              <w:right w:val="single" w:sz="4" w:space="0" w:color="D9D9D9"/>
+            </w:tcBorders>
             <w:tcMar>
               <w:top w:w="90" w:type="dxa"/>
               <w:left w:w="90" w:type="dxa"/>
               <w:bottom w:w="90" w:type="dxa"/>
               <w:right w:w="90" w:type="dxa"/>
             </w:tcMar>
-            <w:tcBorders>
-              <w:top w:val="single" w:sz="4" w:color="D9D9D9"/>
-              <w:left w:val="single" w:sz="4" w:color="D9D9D9"/>
-              <w:bottom w:val="single" w:sz="4" w:color="D9D9D9"/>
-              <w:right w:val="single" w:sz="4" w:color="D9D9D9"/>
-            </w:tcBorders>
+            <w:vAlign w:val="center"/>
           </w:tcPr>
           <w:p>
             <w:pPr>
               <w:spacing w:after="0" w:line="240" w:lineRule="auto"/>
-              <w:jc w:val="left"/>
             </w:pPr>
             <w:r>
               <w:rPr>
-                <w:b w:val="0"/>
                 <w:sz w:val="20"/>
               </w:rPr>
               <w:t>Men’s Email</w:t>
@@ -377,20 +401,20 @@
         </w:tc>
         <w:tc>
           <w:tcPr>
-            <w:tcW w:type="dxa" w:w="1786"/>
-            <w:vAlign w:val="center"/>
+            <w:tcW w:w="1786" w:type="dxa"/>
+            <w:tcBorders>
+              <w:top w:val="single" w:sz="4" w:space="0" w:color="D9D9D9"/>
+              <w:left w:val="single" w:sz="4" w:space="0" w:color="D9D9D9"/>
+              <w:bottom w:val="single" w:sz="4" w:space="0" w:color="D9D9D9"/>
+              <w:right w:val="single" w:sz="4" w:space="0" w:color="D9D9D9"/>
+            </w:tcBorders>
             <w:tcMar>
               <w:top w:w="90" w:type="dxa"/>
               <w:left w:w="90" w:type="dxa"/>
               <w:bottom w:w="90" w:type="dxa"/>
               <w:right w:w="90" w:type="dxa"/>
             </w:tcMar>
-            <w:tcBorders>
-              <w:top w:val="single" w:sz="4" w:color="D9D9D9"/>
-              <w:left w:val="single" w:sz="4" w:color="D9D9D9"/>
-              <w:bottom w:val="single" w:sz="4" w:color="D9D9D9"/>
-              <w:right w:val="single" w:sz="4" w:color="D9D9D9"/>
-            </w:tcBorders>
+            <w:vAlign w:val="center"/>
           </w:tcPr>
           <w:p>
             <w:pPr>
@@ -399,7 +423,6 @@
             </w:pPr>
             <w:r>
               <w:rPr>
-                <w:b w:val="0"/>
                 <w:sz w:val="20"/>
               </w:rPr>
               <w:t>17,046</w:t>
@@ -408,20 +431,20 @@
         </w:tc>
         <w:tc>
           <w:tcPr>
-            <w:tcW w:type="dxa" w:w="1786"/>
-            <w:vAlign w:val="center"/>
+            <w:tcW w:w="1786" w:type="dxa"/>
+            <w:tcBorders>
+              <w:top w:val="single" w:sz="4" w:space="0" w:color="D9D9D9"/>
+              <w:left w:val="single" w:sz="4" w:space="0" w:color="D9D9D9"/>
+              <w:bottom w:val="single" w:sz="4" w:space="0" w:color="D9D9D9"/>
+              <w:right w:val="single" w:sz="4" w:space="0" w:color="D9D9D9"/>
+            </w:tcBorders>
             <w:tcMar>
               <w:top w:w="90" w:type="dxa"/>
               <w:left w:w="90" w:type="dxa"/>
               <w:bottom w:w="90" w:type="dxa"/>
               <w:right w:w="90" w:type="dxa"/>
             </w:tcMar>
-            <w:tcBorders>
-              <w:top w:val="single" w:sz="4" w:color="D9D9D9"/>
-              <w:left w:val="single" w:sz="4" w:color="D9D9D9"/>
-              <w:bottom w:val="single" w:sz="4" w:color="D9D9D9"/>
-              <w:right w:val="single" w:sz="4" w:color="D9D9D9"/>
-            </w:tcBorders>
+            <w:vAlign w:val="center"/>
           </w:tcPr>
           <w:p>
             <w:pPr>
@@ -430,7 +453,6 @@
             </w:pPr>
             <w:r>
               <w:rPr>
-                <w:b w:val="0"/>
                 <w:sz w:val="20"/>
               </w:rPr>
               <w:t>214</w:t>
@@ -439,20 +461,20 @@
         </w:tc>
         <w:tc>
           <w:tcPr>
-            <w:tcW w:type="dxa" w:w="1786"/>
-            <w:vAlign w:val="center"/>
+            <w:tcW w:w="1786" w:type="dxa"/>
+            <w:tcBorders>
+              <w:top w:val="single" w:sz="4" w:space="0" w:color="D9D9D9"/>
+              <w:left w:val="single" w:sz="4" w:space="0" w:color="D9D9D9"/>
+              <w:bottom w:val="single" w:sz="4" w:space="0" w:color="D9D9D9"/>
+              <w:right w:val="single" w:sz="4" w:space="0" w:color="D9D9D9"/>
+            </w:tcBorders>
             <w:tcMar>
               <w:top w:w="90" w:type="dxa"/>
               <w:left w:w="90" w:type="dxa"/>
               <w:bottom w:w="90" w:type="dxa"/>
               <w:right w:w="90" w:type="dxa"/>
             </w:tcMar>
-            <w:tcBorders>
-              <w:top w:val="single" w:sz="4" w:color="D9D9D9"/>
-              <w:left w:val="single" w:sz="4" w:color="D9D9D9"/>
-              <w:bottom w:val="single" w:sz="4" w:color="D9D9D9"/>
-              <w:right w:val="single" w:sz="4" w:color="D9D9D9"/>
-            </w:tcBorders>
+            <w:vAlign w:val="center"/>
           </w:tcPr>
           <w:p>
             <w:pPr>
@@ -461,7 +483,6 @@
             </w:pPr>
             <w:r>
               <w:rPr>
-                <w:b w:val="0"/>
                 <w:sz w:val="20"/>
               </w:rPr>
               <w:t>4,261</w:t>
@@ -470,20 +491,20 @@
         </w:tc>
         <w:tc>
           <w:tcPr>
-            <w:tcW w:type="dxa" w:w="1771"/>
-            <w:vAlign w:val="center"/>
+            <w:tcW w:w="1771" w:type="dxa"/>
+            <w:tcBorders>
+              <w:top w:val="single" w:sz="4" w:space="0" w:color="D9D9D9"/>
+              <w:left w:val="single" w:sz="4" w:space="0" w:color="D9D9D9"/>
+              <w:bottom w:val="single" w:sz="4" w:space="0" w:color="D9D9D9"/>
+              <w:right w:val="single" w:sz="4" w:space="0" w:color="D9D9D9"/>
+            </w:tcBorders>
             <w:tcMar>
               <w:top w:w="90" w:type="dxa"/>
               <w:left w:w="90" w:type="dxa"/>
               <w:bottom w:w="90" w:type="dxa"/>
               <w:right w:w="90" w:type="dxa"/>
             </w:tcMar>
-            <w:tcBorders>
-              <w:top w:val="single" w:sz="4" w:color="D9D9D9"/>
-              <w:left w:val="single" w:sz="4" w:color="D9D9D9"/>
-              <w:bottom w:val="single" w:sz="4" w:color="D9D9D9"/>
-              <w:right w:val="single" w:sz="4" w:color="D9D9D9"/>
-            </w:tcBorders>
+            <w:vAlign w:val="center"/>
           </w:tcPr>
           <w:p>
             <w:pPr>
@@ -492,7 +513,6 @@
             </w:pPr>
             <w:r>
               <w:rPr>
-                <w:b w:val="0"/>
                 <w:sz w:val="20"/>
               </w:rPr>
               <w:t>53</w:t>
@@ -503,32 +523,31 @@
       <w:tr>
         <w:trPr>
           <w:cantSplit/>
+          <w:jc w:val="center"/>
         </w:trPr>
         <w:tc>
           <w:tcPr>
-            <w:tcW w:type="dxa" w:w="2232"/>
-            <w:vAlign w:val="center"/>
+            <w:tcW w:w="2232" w:type="dxa"/>
+            <w:tcBorders>
+              <w:top w:val="single" w:sz="4" w:space="0" w:color="D9D9D9"/>
+              <w:left w:val="single" w:sz="4" w:space="0" w:color="D9D9D9"/>
+              <w:bottom w:val="single" w:sz="4" w:space="0" w:color="D9D9D9"/>
+              <w:right w:val="single" w:sz="4" w:space="0" w:color="D9D9D9"/>
+            </w:tcBorders>
             <w:tcMar>
               <w:top w:w="90" w:type="dxa"/>
               <w:left w:w="90" w:type="dxa"/>
               <w:bottom w:w="90" w:type="dxa"/>
               <w:right w:w="90" w:type="dxa"/>
             </w:tcMar>
-            <w:tcBorders>
-              <w:top w:val="single" w:sz="4" w:color="D9D9D9"/>
-              <w:left w:val="single" w:sz="4" w:color="D9D9D9"/>
-              <w:bottom w:val="single" w:sz="4" w:color="D9D9D9"/>
-              <w:right w:val="single" w:sz="4" w:color="D9D9D9"/>
-            </w:tcBorders>
+            <w:vAlign w:val="center"/>
           </w:tcPr>
           <w:p>
             <w:pPr>
               <w:spacing w:after="0" w:line="240" w:lineRule="auto"/>
-              <w:jc w:val="left"/>
             </w:pPr>
             <w:r>
               <w:rPr>
-                <w:b w:val="0"/>
                 <w:sz w:val="20"/>
               </w:rPr>
               <w:t>No Email</w:t>
@@ -537,20 +556,20 @@
         </w:tc>
         <w:tc>
           <w:tcPr>
-            <w:tcW w:type="dxa" w:w="1786"/>
-            <w:vAlign w:val="center"/>
+            <w:tcW w:w="1786" w:type="dxa"/>
+            <w:tcBorders>
+              <w:top w:val="single" w:sz="4" w:space="0" w:color="D9D9D9"/>
+              <w:left w:val="single" w:sz="4" w:space="0" w:color="D9D9D9"/>
+              <w:bottom w:val="single" w:sz="4" w:space="0" w:color="D9D9D9"/>
+              <w:right w:val="single" w:sz="4" w:space="0" w:color="D9D9D9"/>
+            </w:tcBorders>
             <w:tcMar>
               <w:top w:w="90" w:type="dxa"/>
               <w:left w:w="90" w:type="dxa"/>
               <w:bottom w:w="90" w:type="dxa"/>
               <w:right w:w="90" w:type="dxa"/>
             </w:tcMar>
-            <w:tcBorders>
-              <w:top w:val="single" w:sz="4" w:color="D9D9D9"/>
-              <w:left w:val="single" w:sz="4" w:color="D9D9D9"/>
-              <w:bottom w:val="single" w:sz="4" w:color="D9D9D9"/>
-              <w:right w:val="single" w:sz="4" w:color="D9D9D9"/>
-            </w:tcBorders>
+            <w:vAlign w:val="center"/>
           </w:tcPr>
           <w:p>
             <w:pPr>
@@ -559,7 +578,6 @@
             </w:pPr>
             <w:r>
               <w:rPr>
-                <w:b w:val="0"/>
                 <w:sz w:val="20"/>
               </w:rPr>
               <w:t>17,045</w:t>
@@ -568,20 +586,20 @@
         </w:tc>
         <w:tc>
           <w:tcPr>
-            <w:tcW w:type="dxa" w:w="1786"/>
-            <w:vAlign w:val="center"/>
+            <w:tcW w:w="1786" w:type="dxa"/>
+            <w:tcBorders>
+              <w:top w:val="single" w:sz="4" w:space="0" w:color="D9D9D9"/>
+              <w:left w:val="single" w:sz="4" w:space="0" w:color="D9D9D9"/>
+              <w:bottom w:val="single" w:sz="4" w:space="0" w:color="D9D9D9"/>
+              <w:right w:val="single" w:sz="4" w:space="0" w:color="D9D9D9"/>
+            </w:tcBorders>
             <w:tcMar>
               <w:top w:w="90" w:type="dxa"/>
               <w:left w:w="90" w:type="dxa"/>
               <w:bottom w:w="90" w:type="dxa"/>
               <w:right w:w="90" w:type="dxa"/>
             </w:tcMar>
-            <w:tcBorders>
-              <w:top w:val="single" w:sz="4" w:color="D9D9D9"/>
-              <w:left w:val="single" w:sz="4" w:color="D9D9D9"/>
-              <w:bottom w:val="single" w:sz="4" w:color="D9D9D9"/>
-              <w:right w:val="single" w:sz="4" w:color="D9D9D9"/>
-            </w:tcBorders>
+            <w:vAlign w:val="center"/>
           </w:tcPr>
           <w:p>
             <w:pPr>
@@ -590,7 +608,6 @@
             </w:pPr>
             <w:r>
               <w:rPr>
-                <w:b w:val="0"/>
                 <w:sz w:val="20"/>
               </w:rPr>
               <w:t>98</w:t>
@@ -599,20 +616,20 @@
         </w:tc>
         <w:tc>
           <w:tcPr>
-            <w:tcW w:type="dxa" w:w="1786"/>
-            <w:vAlign w:val="center"/>
+            <w:tcW w:w="1786" w:type="dxa"/>
+            <w:tcBorders>
+              <w:top w:val="single" w:sz="4" w:space="0" w:color="D9D9D9"/>
+              <w:left w:val="single" w:sz="4" w:space="0" w:color="D9D9D9"/>
+              <w:bottom w:val="single" w:sz="4" w:space="0" w:color="D9D9D9"/>
+              <w:right w:val="single" w:sz="4" w:space="0" w:color="D9D9D9"/>
+            </w:tcBorders>
             <w:tcMar>
               <w:top w:w="90" w:type="dxa"/>
               <w:left w:w="90" w:type="dxa"/>
               <w:bottom w:w="90" w:type="dxa"/>
               <w:right w:w="90" w:type="dxa"/>
             </w:tcMar>
-            <w:tcBorders>
-              <w:top w:val="single" w:sz="4" w:color="D9D9D9"/>
-              <w:left w:val="single" w:sz="4" w:color="D9D9D9"/>
-              <w:bottom w:val="single" w:sz="4" w:color="D9D9D9"/>
-              <w:right w:val="single" w:sz="4" w:color="D9D9D9"/>
-            </w:tcBorders>
+            <w:vAlign w:val="center"/>
           </w:tcPr>
           <w:p>
             <w:pPr>
@@ -621,7 +638,6 @@
             </w:pPr>
             <w:r>
               <w:rPr>
-                <w:b w:val="0"/>
                 <w:sz w:val="20"/>
               </w:rPr>
               <w:t>4,261</w:t>
@@ -630,20 +646,20 @@
         </w:tc>
         <w:tc>
           <w:tcPr>
-            <w:tcW w:type="dxa" w:w="1771"/>
-            <w:vAlign w:val="center"/>
+            <w:tcW w:w="1771" w:type="dxa"/>
+            <w:tcBorders>
+              <w:top w:val="single" w:sz="4" w:space="0" w:color="D9D9D9"/>
+              <w:left w:val="single" w:sz="4" w:space="0" w:color="D9D9D9"/>
+              <w:bottom w:val="single" w:sz="4" w:space="0" w:color="D9D9D9"/>
+              <w:right w:val="single" w:sz="4" w:space="0" w:color="D9D9D9"/>
+            </w:tcBorders>
             <w:tcMar>
               <w:top w:w="90" w:type="dxa"/>
               <w:left w:w="90" w:type="dxa"/>
               <w:bottom w:w="90" w:type="dxa"/>
               <w:right w:w="90" w:type="dxa"/>
             </w:tcMar>
-            <w:tcBorders>
-              <w:top w:val="single" w:sz="4" w:color="D9D9D9"/>
-              <w:left w:val="single" w:sz="4" w:color="D9D9D9"/>
-              <w:bottom w:val="single" w:sz="4" w:color="D9D9D9"/>
-              <w:right w:val="single" w:sz="4" w:color="D9D9D9"/>
-            </w:tcBorders>
+            <w:vAlign w:val="center"/>
           </w:tcPr>
           <w:p>
             <w:pPr>
@@ -652,7 +668,6 @@
             </w:pPr>
             <w:r>
               <w:rPr>
-                <w:b w:val="0"/>
                 <w:sz w:val="20"/>
               </w:rPr>
               <w:t>24</w:t>
@@ -663,32 +678,31 @@
       <w:tr>
         <w:trPr>
           <w:cantSplit/>
+          <w:jc w:val="center"/>
         </w:trPr>
         <w:tc>
           <w:tcPr>
-            <w:tcW w:type="dxa" w:w="2232"/>
-            <w:vAlign w:val="center"/>
+            <w:tcW w:w="2232" w:type="dxa"/>
+            <w:tcBorders>
+              <w:top w:val="single" w:sz="4" w:space="0" w:color="D9D9D9"/>
+              <w:left w:val="single" w:sz="4" w:space="0" w:color="D9D9D9"/>
+              <w:bottom w:val="single" w:sz="4" w:space="0" w:color="D9D9D9"/>
+              <w:right w:val="single" w:sz="4" w:space="0" w:color="D9D9D9"/>
+            </w:tcBorders>
             <w:tcMar>
               <w:top w:w="90" w:type="dxa"/>
               <w:left w:w="90" w:type="dxa"/>
               <w:bottom w:w="90" w:type="dxa"/>
               <w:right w:w="90" w:type="dxa"/>
             </w:tcMar>
-            <w:tcBorders>
-              <w:top w:val="single" w:sz="4" w:color="D9D9D9"/>
-              <w:left w:val="single" w:sz="4" w:color="D9D9D9"/>
-              <w:bottom w:val="single" w:sz="4" w:color="D9D9D9"/>
-              <w:right w:val="single" w:sz="4" w:color="D9D9D9"/>
-            </w:tcBorders>
+            <w:vAlign w:val="center"/>
           </w:tcPr>
           <w:p>
             <w:pPr>
               <w:spacing w:after="0" w:line="240" w:lineRule="auto"/>
-              <w:jc w:val="left"/>
             </w:pPr>
             <w:r>
               <w:rPr>
-                <w:b w:val="0"/>
                 <w:sz w:val="20"/>
               </w:rPr>
               <w:t>Women’s Email</w:t>
@@ -697,20 +711,20 @@
         </w:tc>
         <w:tc>
           <w:tcPr>
-            <w:tcW w:type="dxa" w:w="1786"/>
-            <w:vAlign w:val="center"/>
+            <w:tcW w:w="1786" w:type="dxa"/>
+            <w:tcBorders>
+              <w:top w:val="single" w:sz="4" w:space="0" w:color="D9D9D9"/>
+              <w:left w:val="single" w:sz="4" w:space="0" w:color="D9D9D9"/>
+              <w:bottom w:val="single" w:sz="4" w:space="0" w:color="D9D9D9"/>
+              <w:right w:val="single" w:sz="4" w:space="0" w:color="D9D9D9"/>
+            </w:tcBorders>
             <w:tcMar>
               <w:top w:w="90" w:type="dxa"/>
               <w:left w:w="90" w:type="dxa"/>
               <w:bottom w:w="90" w:type="dxa"/>
               <w:right w:w="90" w:type="dxa"/>
             </w:tcMar>
-            <w:tcBorders>
-              <w:top w:val="single" w:sz="4" w:color="D9D9D9"/>
-              <w:left w:val="single" w:sz="4" w:color="D9D9D9"/>
-              <w:bottom w:val="single" w:sz="4" w:color="D9D9D9"/>
-              <w:right w:val="single" w:sz="4" w:color="D9D9D9"/>
-            </w:tcBorders>
+            <w:vAlign w:val="center"/>
           </w:tcPr>
           <w:p>
             <w:pPr>
@@ -719,7 +733,6 @@
             </w:pPr>
             <w:r>
               <w:rPr>
-                <w:b w:val="0"/>
                 <w:sz w:val="20"/>
               </w:rPr>
               <w:t>17,109</w:t>
@@ -728,20 +741,20 @@
         </w:tc>
         <w:tc>
           <w:tcPr>
-            <w:tcW w:type="dxa" w:w="1786"/>
-            <w:vAlign w:val="center"/>
+            <w:tcW w:w="1786" w:type="dxa"/>
+            <w:tcBorders>
+              <w:top w:val="single" w:sz="4" w:space="0" w:color="D9D9D9"/>
+              <w:left w:val="single" w:sz="4" w:space="0" w:color="D9D9D9"/>
+              <w:bottom w:val="single" w:sz="4" w:space="0" w:color="D9D9D9"/>
+              <w:right w:val="single" w:sz="4" w:space="0" w:color="D9D9D9"/>
+            </w:tcBorders>
             <w:tcMar>
               <w:top w:w="90" w:type="dxa"/>
               <w:left w:w="90" w:type="dxa"/>
               <w:bottom w:w="90" w:type="dxa"/>
               <w:right w:w="90" w:type="dxa"/>
             </w:tcMar>
-            <w:tcBorders>
-              <w:top w:val="single" w:sz="4" w:color="D9D9D9"/>
-              <w:left w:val="single" w:sz="4" w:color="D9D9D9"/>
-              <w:bottom w:val="single" w:sz="4" w:color="D9D9D9"/>
-              <w:right w:val="single" w:sz="4" w:color="D9D9D9"/>
-            </w:tcBorders>
+            <w:vAlign w:val="center"/>
           </w:tcPr>
           <w:p>
             <w:pPr>
@@ -750,7 +763,6 @@
             </w:pPr>
             <w:r>
               <w:rPr>
-                <w:b w:val="0"/>
                 <w:sz w:val="20"/>
               </w:rPr>
               <w:t>151</w:t>
@@ -759,20 +771,20 @@
         </w:tc>
         <w:tc>
           <w:tcPr>
-            <w:tcW w:type="dxa" w:w="1786"/>
-            <w:vAlign w:val="center"/>
+            <w:tcW w:w="1786" w:type="dxa"/>
+            <w:tcBorders>
+              <w:top w:val="single" w:sz="4" w:space="0" w:color="D9D9D9"/>
+              <w:left w:val="single" w:sz="4" w:space="0" w:color="D9D9D9"/>
+              <w:bottom w:val="single" w:sz="4" w:space="0" w:color="D9D9D9"/>
+              <w:right w:val="single" w:sz="4" w:space="0" w:color="D9D9D9"/>
+            </w:tcBorders>
             <w:tcMar>
               <w:top w:w="90" w:type="dxa"/>
               <w:left w:w="90" w:type="dxa"/>
               <w:bottom w:w="90" w:type="dxa"/>
               <w:right w:w="90" w:type="dxa"/>
             </w:tcMar>
-            <w:tcBorders>
-              <w:top w:val="single" w:sz="4" w:color="D9D9D9"/>
-              <w:left w:val="single" w:sz="4" w:color="D9D9D9"/>
-              <w:bottom w:val="single" w:sz="4" w:color="D9D9D9"/>
-              <w:right w:val="single" w:sz="4" w:color="D9D9D9"/>
-            </w:tcBorders>
+            <w:vAlign w:val="center"/>
           </w:tcPr>
           <w:p>
             <w:pPr>
@@ -781,7 +793,6 @@
             </w:pPr>
             <w:r>
               <w:rPr>
-                <w:b w:val="0"/>
                 <w:sz w:val="20"/>
               </w:rPr>
               <w:t>4,278</w:t>
@@ -790,20 +801,20 @@
         </w:tc>
         <w:tc>
           <w:tcPr>
-            <w:tcW w:type="dxa" w:w="1771"/>
-            <w:vAlign w:val="center"/>
+            <w:tcW w:w="1771" w:type="dxa"/>
+            <w:tcBorders>
+              <w:top w:val="single" w:sz="4" w:space="0" w:color="D9D9D9"/>
+              <w:left w:val="single" w:sz="4" w:space="0" w:color="D9D9D9"/>
+              <w:bottom w:val="single" w:sz="4" w:space="0" w:color="D9D9D9"/>
+              <w:right w:val="single" w:sz="4" w:space="0" w:color="D9D9D9"/>
+            </w:tcBorders>
             <w:tcMar>
               <w:top w:w="90" w:type="dxa"/>
               <w:left w:w="90" w:type="dxa"/>
               <w:bottom w:w="90" w:type="dxa"/>
               <w:right w:w="90" w:type="dxa"/>
             </w:tcMar>
-            <w:tcBorders>
-              <w:top w:val="single" w:sz="4" w:color="D9D9D9"/>
-              <w:left w:val="single" w:sz="4" w:color="D9D9D9"/>
-              <w:bottom w:val="single" w:sz="4" w:color="D9D9D9"/>
-              <w:right w:val="single" w:sz="4" w:color="D9D9D9"/>
-            </w:tcBorders>
+            <w:vAlign w:val="center"/>
           </w:tcPr>
           <w:p>
             <w:pPr>
@@ -812,7 +823,6 @@
             </w:pPr>
             <w:r>
               <w:rPr>
-                <w:b w:val="0"/>
                 <w:sz w:val="20"/>
               </w:rPr>
               <w:t>38</w:t>
@@ -823,28 +833,28 @@
       <w:tr>
         <w:trPr>
           <w:cantSplit/>
+          <w:jc w:val="center"/>
         </w:trPr>
         <w:tc>
           <w:tcPr>
-            <w:tcW w:type="dxa" w:w="2232"/>
-            <w:vAlign w:val="center"/>
+            <w:tcW w:w="2232" w:type="dxa"/>
+            <w:tcBorders>
+              <w:top w:val="single" w:sz="4" w:space="0" w:color="D9D9D9"/>
+              <w:left w:val="single" w:sz="4" w:space="0" w:color="D9D9D9"/>
+              <w:bottom w:val="single" w:sz="4" w:space="0" w:color="D9D9D9"/>
+              <w:right w:val="single" w:sz="4" w:space="0" w:color="D9D9D9"/>
+            </w:tcBorders>
             <w:tcMar>
               <w:top w:w="90" w:type="dxa"/>
               <w:left w:w="90" w:type="dxa"/>
               <w:bottom w:w="90" w:type="dxa"/>
               <w:right w:w="90" w:type="dxa"/>
             </w:tcMar>
-            <w:tcBorders>
-              <w:top w:val="single" w:sz="4" w:color="D9D9D9"/>
-              <w:left w:val="single" w:sz="4" w:color="D9D9D9"/>
-              <w:bottom w:val="single" w:sz="4" w:color="D9D9D9"/>
-              <w:right w:val="single" w:sz="4" w:color="D9D9D9"/>
-            </w:tcBorders>
+            <w:vAlign w:val="center"/>
           </w:tcPr>
           <w:p>
             <w:pPr>
               <w:spacing w:after="0" w:line="240" w:lineRule="auto"/>
-              <w:jc w:val="left"/>
             </w:pPr>
             <w:r>
               <w:rPr>
@@ -857,20 +867,20 @@
         </w:tc>
         <w:tc>
           <w:tcPr>
-            <w:tcW w:type="dxa" w:w="1786"/>
-            <w:vAlign w:val="center"/>
+            <w:tcW w:w="1786" w:type="dxa"/>
+            <w:tcBorders>
+              <w:top w:val="single" w:sz="4" w:space="0" w:color="D9D9D9"/>
+              <w:left w:val="single" w:sz="4" w:space="0" w:color="D9D9D9"/>
+              <w:bottom w:val="single" w:sz="4" w:space="0" w:color="D9D9D9"/>
+              <w:right w:val="single" w:sz="4" w:space="0" w:color="D9D9D9"/>
+            </w:tcBorders>
             <w:tcMar>
               <w:top w:w="90" w:type="dxa"/>
               <w:left w:w="90" w:type="dxa"/>
               <w:bottom w:w="90" w:type="dxa"/>
               <w:right w:w="90" w:type="dxa"/>
             </w:tcMar>
-            <w:tcBorders>
-              <w:top w:val="single" w:sz="4" w:color="D9D9D9"/>
-              <w:left w:val="single" w:sz="4" w:color="D9D9D9"/>
-              <w:bottom w:val="single" w:sz="4" w:color="D9D9D9"/>
-              <w:right w:val="single" w:sz="4" w:color="D9D9D9"/>
-            </w:tcBorders>
+            <w:vAlign w:val="center"/>
           </w:tcPr>
           <w:p>
             <w:pPr>
@@ -888,20 +898,20 @@
         </w:tc>
         <w:tc>
           <w:tcPr>
-            <w:tcW w:type="dxa" w:w="1786"/>
-            <w:vAlign w:val="center"/>
+            <w:tcW w:w="1786" w:type="dxa"/>
+            <w:tcBorders>
+              <w:top w:val="single" w:sz="4" w:space="0" w:color="D9D9D9"/>
+              <w:left w:val="single" w:sz="4" w:space="0" w:color="D9D9D9"/>
+              <w:bottom w:val="single" w:sz="4" w:space="0" w:color="D9D9D9"/>
+              <w:right w:val="single" w:sz="4" w:space="0" w:color="D9D9D9"/>
+            </w:tcBorders>
             <w:tcMar>
               <w:top w:w="90" w:type="dxa"/>
               <w:left w:w="90" w:type="dxa"/>
               <w:bottom w:w="90" w:type="dxa"/>
               <w:right w:w="90" w:type="dxa"/>
             </w:tcMar>
-            <w:tcBorders>
-              <w:top w:val="single" w:sz="4" w:color="D9D9D9"/>
-              <w:left w:val="single" w:sz="4" w:color="D9D9D9"/>
-              <w:bottom w:val="single" w:sz="4" w:color="D9D9D9"/>
-              <w:right w:val="single" w:sz="4" w:color="D9D9D9"/>
-            </w:tcBorders>
+            <w:vAlign w:val="center"/>
           </w:tcPr>
           <w:p>
             <w:pPr>
@@ -919,20 +929,20 @@
         </w:tc>
         <w:tc>
           <w:tcPr>
-            <w:tcW w:type="dxa" w:w="1786"/>
-            <w:vAlign w:val="center"/>
+            <w:tcW w:w="1786" w:type="dxa"/>
+            <w:tcBorders>
+              <w:top w:val="single" w:sz="4" w:space="0" w:color="D9D9D9"/>
+              <w:left w:val="single" w:sz="4" w:space="0" w:color="D9D9D9"/>
+              <w:bottom w:val="single" w:sz="4" w:space="0" w:color="D9D9D9"/>
+              <w:right w:val="single" w:sz="4" w:space="0" w:color="D9D9D9"/>
+            </w:tcBorders>
             <w:tcMar>
               <w:top w:w="90" w:type="dxa"/>
               <w:left w:w="90" w:type="dxa"/>
               <w:bottom w:w="90" w:type="dxa"/>
               <w:right w:w="90" w:type="dxa"/>
             </w:tcMar>
-            <w:tcBorders>
-              <w:top w:val="single" w:sz="4" w:color="D9D9D9"/>
-              <w:left w:val="single" w:sz="4" w:color="D9D9D9"/>
-              <w:bottom w:val="single" w:sz="4" w:color="D9D9D9"/>
-              <w:right w:val="single" w:sz="4" w:color="D9D9D9"/>
-            </w:tcBorders>
+            <w:vAlign w:val="center"/>
           </w:tcPr>
           <w:p>
             <w:pPr>
@@ -950,20 +960,20 @@
         </w:tc>
         <w:tc>
           <w:tcPr>
-            <w:tcW w:type="dxa" w:w="1771"/>
-            <w:vAlign w:val="center"/>
+            <w:tcW w:w="1771" w:type="dxa"/>
+            <w:tcBorders>
+              <w:top w:val="single" w:sz="4" w:space="0" w:color="D9D9D9"/>
+              <w:left w:val="single" w:sz="4" w:space="0" w:color="D9D9D9"/>
+              <w:bottom w:val="single" w:sz="4" w:space="0" w:color="D9D9D9"/>
+              <w:right w:val="single" w:sz="4" w:space="0" w:color="D9D9D9"/>
+            </w:tcBorders>
             <w:tcMar>
               <w:top w:w="90" w:type="dxa"/>
               <w:left w:w="90" w:type="dxa"/>
               <w:bottom w:w="90" w:type="dxa"/>
               <w:right w:w="90" w:type="dxa"/>
             </w:tcMar>
-            <w:tcBorders>
-              <w:top w:val="single" w:sz="4" w:color="D9D9D9"/>
-              <w:left w:val="single" w:sz="4" w:color="D9D9D9"/>
-              <w:bottom w:val="single" w:sz="4" w:color="D9D9D9"/>
-              <w:right w:val="single" w:sz="4" w:color="D9D9D9"/>
-            </w:tcBorders>
+            <w:vAlign w:val="center"/>
           </w:tcPr>
           <w:p>
             <w:pPr>
@@ -1004,8 +1014,24 @@
         <w:t>Next, we will revise preprocessing so that imputation, scaling, and encoding learn only from the training portion of development data. Model training and final test evaluation have not yet been carried out.</w:t>
       </w:r>
     </w:p>
+    <w:p/>
+    <w:p>
+      <w:r>
+        <w:t xml:space="preserve">GITHUB REPO - </w:t>
+      </w:r>
+      <w:hyperlink r:id="rId8" w:history="1">
+        <w:r>
+          <w:rPr>
+            <w:rStyle w:val="Hyperlink"/>
+          </w:rPr>
+          <w:t>https://github.com/srajan2627/budget-aware-customer-targeting</w:t>
+        </w:r>
+      </w:hyperlink>
+    </w:p>
+    <w:p/>
+    <w:p/>
     <w:sectPr>
-      <w:headerReference w:type="default" r:id="rId8"/>
+      <w:headerReference w:type="default" r:id="rId9"/>
       <w:pgSz w:w="12240" w:h="15840"/>
       <w:pgMar w:top="1944" w:right="1440" w:bottom="1440" w:left="1440" w:header="720" w:footer="720" w:gutter="0"/>
       <w:cols w:space="720"/>
@@ -1069,7 +1095,7 @@
 <w:hdr xmlns:wpc="http://schemas.microsoft.com/office/word/2010/wordprocessingCanvas" xmlns:cx="http://schemas.microsoft.com/office/drawing/2014/chartex" xmlns:cx1="http://schemas.microsoft.com/office/drawing/2015/9/8/chartex" xmlns:cx2="http://schemas.microsoft.com/office/drawing/2015/10/21/chartex" xmlns:cx3="http://schemas.microsoft.com/office/drawing/2016/5/9/chartex" xmlns:cx4="http://schemas.microsoft.com/office/drawing/2016/5/10/chartex" xmlns:cx5="http://schemas.microsoft.com/office/drawing/2016/5/11/chartex" xmlns:cx6="http://schemas.microsoft.com/office/drawing/2016/5/12/chartex" xmlns:cx7="http://schemas.microsoft.com/office/drawing/2016/5/13/chartex" xmlns:cx8="http://schemas.microsoft.com/office/drawing/2016/5/14/chartex" xmlns:mc="http://schemas.openxmlformats.org/markup-compatibility/2006" xmlns:m="http://schemas.openxmlformats.org/officeDocument/2006/math" xmlns:aink="http://schemas.microsoft.com/office/drawing/2016/ink" xmlns:am3d="http://schemas.microsoft.com/office/drawing/2017/model3d" xmlns:oel="http://schemas.microsoft.com/office/2019/extlst" xmlns:r="http://schemas.openxmlformats.org/officeDocument/2006/relationships" xmlns:wp14="http://schemas.microsoft.com/office/word/2010/wordprocessingDrawing" xmlns:wp="http://schemas.openxmlformats.org/drawingml/2006/wordprocessingDrawing" xmlns:wpg="http://schemas.microsoft.com/office/word/2010/wordprocessingGroup" xmlns:wpi="http://schemas.microsoft.com/office/word/2010/wordprocessingInk" xmlns:wps="http://schemas.microsoft.com/office/word/2010/wordprocessingShape" xmlns:o="urn:schemas-microsoft-com:office:office" xmlns:v="urn:schemas-microsoft-com:vml" xmlns:w10="urn:schemas-microsoft-com:office:word" xmlns:w="http://schemas.openxmlformats.org/wordprocessingml/2006/main" xmlns:w14="http://schemas.microsoft.com/office/word/2010/wordml" xmlns:w15="http://schemas.microsoft.com/office/word/2012/wordml" xmlns:w16cex="http://schemas.microsoft.com/office/word/2018/wordml/cex" xmlns:w16cid="http://schemas.microsoft.com/office/word/2016/wordml/cid" xmlns:w16="http://schemas.microsoft.com/office/word/2018/wordml" xmlns:w16sdtdh="http://schemas.microsoft.com/office/word/2020/wordml/sdtdatahash" xmlns:w16sdtfl="http://schemas.microsoft.com/office/word/2024/wordml/sdtformatlock" xmlns:w16se="http://schemas.microsoft.com/office/word/2015/wordml/symex" xmlns:w16du="http://schemas.microsoft.com/office/word/2023/wordml/word16du" xmlns:wne="http://schemas.microsoft.com/office/word/2006/wordml" mc:Ignorable="w14 w15 w16se w16cid w16 w16cex w16sdtdh w16sdtfl w16du wp14">
   <w:p>
     <w:pPr>
-      <w:spacing w:line="240" w:lineRule="auto" w:after="0"/>
+      <w:spacing w:after="0" w:line="240" w:lineRule="auto"/>
       <w:rPr>
         <w:sz w:val="15"/>
         <w:szCs w:val="15"/>
@@ -1077,7 +1103,6 @@
     </w:pPr>
     <w:r>
       <w:rPr>
-        <w:color w:val="000000"/>
         <w:sz w:val="20"/>
         <w:szCs w:val="15"/>
       </w:rPr>
@@ -1086,7 +1111,7 @@
   </w:p>
   <w:p>
     <w:pPr>
-      <w:spacing w:line="240" w:lineRule="auto" w:after="0"/>
+      <w:spacing w:after="0" w:line="240" w:lineRule="auto"/>
       <w:rPr>
         <w:sz w:val="15"/>
         <w:szCs w:val="15"/>
@@ -1094,7 +1119,6 @@
     </w:pPr>
     <w:r>
       <w:rPr>
-        <w:color w:val="000000"/>
         <w:sz w:val="20"/>
         <w:szCs w:val="15"/>
       </w:rPr>
@@ -1103,7 +1127,7 @@
   </w:p>
   <w:p>
     <w:pPr>
-      <w:spacing w:line="240" w:lineRule="auto" w:after="0"/>
+      <w:spacing w:after="0" w:line="240" w:lineRule="auto"/>
       <w:rPr>
         <w:sz w:val="15"/>
         <w:szCs w:val="15"/>
@@ -1111,7 +1135,6 @@
     </w:pPr>
     <w:r>
       <w:rPr>
-        <w:color w:val="000000"/>
         <w:sz w:val="20"/>
         <w:szCs w:val="15"/>
       </w:rPr>
@@ -1120,7 +1143,7 @@
   </w:p>
   <w:p>
     <w:pPr>
-      <w:spacing w:line="240" w:lineRule="auto" w:after="0"/>
+      <w:spacing w:after="0" w:line="240" w:lineRule="auto"/>
       <w:rPr>
         <w:sz w:val="15"/>
         <w:szCs w:val="15"/>
@@ -1128,7 +1151,6 @@
     </w:pPr>
     <w:r>
       <w:rPr>
-        <w:color w:val="000000"/>
         <w:sz w:val="20"/>
         <w:szCs w:val="15"/>
       </w:rPr>
@@ -1136,7 +1158,6 @@
     </w:r>
     <w:r>
       <w:rPr>
-        <w:color w:val="000000"/>
         <w:sz w:val="20"/>
         <w:szCs w:val="15"/>
       </w:rPr>
@@ -1144,7 +1165,6 @@
     </w:r>
     <w:r>
       <w:rPr>
-        <w:color w:val="000000"/>
         <w:sz w:val="20"/>
         <w:szCs w:val="15"/>
       </w:rPr>
@@ -1154,7 +1174,6 @@
   <w:p>
     <w:pPr>
       <w:pStyle w:val="Header"/>
-      <w:spacing w:after="0" w:line="240" w:lineRule="auto"/>
     </w:pPr>
   </w:p>
 </w:hdr>
@@ -1737,12 +1756,11 @@
     <w:pPr>
       <w:keepNext/>
       <w:keepLines/>
-      <w:spacing w:before="360" w:after="140" w:line="259" w:lineRule="auto"/>
+      <w:spacing w:before="360"/>
       <w:outlineLvl w:val="0"/>
     </w:pPr>
     <w:rPr>
-      <w:rFonts w:asciiTheme="majorHAnsi" w:eastAsiaTheme="majorEastAsia" w:hAnsiTheme="majorHAnsi" w:cstheme="majorBidi" w:ascii="Times New Roman" w:hAnsi="Times New Roman"/>
-      <w:color w:val="000000"/>
+      <w:rFonts w:asciiTheme="majorHAnsi" w:eastAsiaTheme="majorEastAsia" w:hAnsiTheme="majorHAnsi" w:cstheme="majorBidi"/>
       <w:sz w:val="26"/>
       <w:szCs w:val="40"/>
     </w:rPr>
@@ -1760,12 +1778,11 @@
     <w:pPr>
       <w:keepNext/>
       <w:keepLines/>
-      <w:spacing w:before="160" w:after="140" w:line="259" w:lineRule="auto"/>
+      <w:spacing w:before="160"/>
       <w:outlineLvl w:val="1"/>
     </w:pPr>
     <w:rPr>
-      <w:rFonts w:asciiTheme="majorHAnsi" w:eastAsiaTheme="majorEastAsia" w:hAnsiTheme="majorHAnsi" w:cstheme="majorBidi" w:ascii="Times New Roman" w:hAnsi="Times New Roman"/>
-      <w:color w:val="000000"/>
+      <w:rFonts w:asciiTheme="majorHAnsi" w:eastAsiaTheme="majorEastAsia" w:hAnsiTheme="majorHAnsi" w:cstheme="majorBidi"/>
       <w:sz w:val="26"/>
       <w:szCs w:val="32"/>
     </w:rPr>
@@ -2080,12 +2097,10 @@
     <w:qFormat/>
     <w:rsid w:val="005909C8"/>
     <w:pPr>
-      <w:spacing w:after="140" w:line="259" w:lineRule="auto"/>
       <w:contextualSpacing/>
     </w:pPr>
     <w:rPr>
-      <w:rFonts w:asciiTheme="majorHAnsi" w:eastAsiaTheme="majorEastAsia" w:hAnsiTheme="majorHAnsi" w:cstheme="majorBidi" w:ascii="Times New Roman" w:hAnsi="Times New Roman"/>
-      <w:color w:val="000000"/>
+      <w:rFonts w:asciiTheme="majorHAnsi" w:eastAsiaTheme="majorEastAsia" w:hAnsiTheme="majorHAnsi" w:cstheme="majorBidi"/>
       <w:spacing w:val="-10"/>
       <w:kern w:val="28"/>
       <w:sz w:val="32"/>
@@ -2298,7 +2313,7 @@
       <w:spacing w:before="100" w:beforeAutospacing="1" w:after="100" w:afterAutospacing="1" w:line="240" w:lineRule="auto"/>
     </w:pPr>
     <w:rPr>
-      <w:rFonts w:ascii="Times New Roman" w:eastAsia="Times New Roman" w:hAnsi="Times New Roman" w:cs="Times New Roman"/>
+      <w:rFonts w:eastAsia="Times New Roman" w:cs="Times New Roman"/>
       <w:kern w:val="0"/>
       <w14:ligatures w14:val="none"/>
     </w:rPr>
@@ -2312,6 +2327,29 @@
     <w:rPr>
       <w:b/>
       <w:bCs/>
+    </w:rPr>
+  </w:style>
+  <w:style w:type="character" w:styleId="Hyperlink">
+    <w:name w:val="Hyperlink"/>
+    <w:basedOn w:val="DefaultParagraphFont"/>
+    <w:uiPriority w:val="99"/>
+    <w:unhideWhenUsed/>
+    <w:rsid w:val="002B09F9"/>
+    <w:rPr>
+      <w:color w:val="467886" w:themeColor="hyperlink"/>
+      <w:u w:val="single"/>
+    </w:rPr>
+  </w:style>
+  <w:style w:type="character" w:styleId="UnresolvedMention">
+    <w:name w:val="Unresolved Mention"/>
+    <w:basedOn w:val="DefaultParagraphFont"/>
+    <w:uiPriority w:val="99"/>
+    <w:semiHidden/>
+    <w:unhideWhenUsed/>
+    <w:rsid w:val="002B09F9"/>
+    <w:rPr>
+      <w:color w:val="605E5C"/>
+      <w:shd w:val="clear" w:color="auto" w:fill="E1DFDD"/>
     </w:rPr>
   </w:style>
 </w:styles>

</xml_diff>